<commit_message>
Regenerate resumes/cover letters (2026-09-17_071855)
</commit_message>
<xml_diff>
--- a/generated/SDET/Dennis Dole Resume (SDET).docx
+++ b/generated/SDET/Dennis Dole Resume (SDET).docx
@@ -423,7 +423,7 @@
           <w:color w:val="1F3864"/>
           <w:sz w:val="18"/>
         </w:rPr>
-        <w:t>Docusign Connect, Connect Test Listener (webhook), Ruby Webhook Test Interface, x509 Certificate Management</w:t>
+        <w:t>Docusign Connect · Connect Test Listener (webhook) · Ruby Webhook Test Interface · x509 Certificate Management</w:t>
       </w:r>
     </w:p>
     <w:p>
@@ -544,7 +544,7 @@
           <w:color w:val="1F3864"/>
           <w:sz w:val="18"/>
         </w:rPr>
-        <w:t>Docusign Connect, Product Incubation Team, Docusign Print Tool (deprecated)</w:t>
+        <w:t>Docusign Connect · Product Incubation Team · Docusign Print Tool (deprecated)</w:t>
       </w:r>
     </w:p>
     <w:p>
@@ -728,7 +728,7 @@
           <w:color w:val="1F3864"/>
           <w:sz w:val="18"/>
         </w:rPr>
-        <w:t>Team Foundation Server, Microsoft Test Manager, C#</w:t>
+        <w:t>Team Foundation Server · Microsoft Test Manager · C#</w:t>
       </w:r>
     </w:p>
     <w:p>
@@ -822,7 +822,7 @@
           <w:color w:val="1F3864"/>
           <w:sz w:val="18"/>
         </w:rPr>
-        <w:t>Linux, Eclipse, Hudson, Ant, TestNG, Java, Selenium</w:t>
+        <w:t>Linux · Eclipse · Hudson · Ant · TestNG · Java · Selenium</w:t>
       </w:r>
     </w:p>
     <w:p>
@@ -907,7 +907,7 @@
           <w:color w:val="1F3864"/>
           <w:sz w:val="18"/>
         </w:rPr>
-        <w:t>C#, SQL, WTT, Kahuna Automation Framework (KAF), NUnit, Source Depot, HyperV, Octopus</w:t>
+        <w:t>C# · SQL · WTT · Kahuna Automation Framework (KAF) · NUnit · Source Depot · HyperV · Octopus</w:t>
       </w:r>
     </w:p>
     <w:p>
@@ -1010,7 +1010,7 @@
           <w:color w:val="1F3864"/>
           <w:sz w:val="18"/>
         </w:rPr>
-        <w:t>C#, SQL, WTT, Echo, KAF, NUnit, iMacros, REST, XML, HyperV</w:t>
+        <w:t>C# · SQL · WTT · Echo · KAF · NUnit · iMacros · REST · XML · HyperV</w:t>
       </w:r>
     </w:p>
     <w:p>
@@ -1131,7 +1131,7 @@
           <w:color w:val="1F3864"/>
           <w:sz w:val="18"/>
         </w:rPr>
-        <w:t>Borland JBuilder, Java, Swing, Borland C++, Oracle SQL, PVCS/Serena</w:t>
+        <w:t>Borland JBuilder · Java · Swing · Borland C++ · Oracle SQL · PVCS/Serena</w:t>
       </w:r>
     </w:p>
     <w:p>
@@ -1225,7 +1225,7 @@
           <w:color w:val="1F3864"/>
           <w:sz w:val="18"/>
         </w:rPr>
-        <w:t>Excel, iMacros, Visual Basic, Team Track</w:t>
+        <w:t>Excel · iMacros · Visual Basic · Team Track</w:t>
       </w:r>
     </w:p>
     <w:p>

</xml_diff>